<commit_message>
feat: add Gemini clinical copilot, phone call linking, and standardize MM/DD/YYYY dates
</commit_message>
<xml_diff>
--- a/notes.docx
+++ b/notes.docx
@@ -68,11 +68,23 @@
         <w:pStyle w:val="ListParagraph"/>
         <w:numPr>
           <w:ilvl w:val="0"/>
-          <w:numId w:val="2"/>
+          <w:numId w:val="1"/>
         </w:numPr>
-      </w:pPr>
-      <w:r>
+        <w:rPr>
+          <w:highlight w:val="green"/>
+        </w:rPr>
+      </w:pPr>
+      <w:r>
+        <w:rPr>
+          <w:highlight w:val="green"/>
+        </w:rPr>
         <w:t>Follow up Phone call log</w:t>
+      </w:r>
+      <w:r>
+        <w:rPr>
+          <w:highlight w:val="cyan"/>
+        </w:rPr>
+        <w:t>- Done [Phone Call Log page]</w:t>
       </w:r>
     </w:p>
     <w:p>
@@ -80,11 +92,59 @@
         <w:pStyle w:val="ListParagraph"/>
         <w:numPr>
           <w:ilvl w:val="0"/>
-          <w:numId w:val="2"/>
+          <w:numId w:val="1"/>
         </w:numPr>
-      </w:pPr>
-      <w:r>
-        <w:t>Need ARIA radiographic Severity to separate H and E. Its possible to have moderate E but mild H etc</w:t>
+        <w:rPr>
+          <w:highlight w:val="green"/>
+        </w:rPr>
+      </w:pPr>
+      <w:r>
+        <w:rPr>
+          <w:highlight w:val="green"/>
+        </w:rPr>
+        <w:t xml:space="preserve">Need ARIA radiographic Severity to separate H and E. </w:t>
+      </w:r>
+      <w:proofErr w:type="spellStart"/>
+      <w:proofErr w:type="gramStart"/>
+      <w:r>
+        <w:rPr>
+          <w:highlight w:val="green"/>
+        </w:rPr>
+        <w:t>Its</w:t>
+      </w:r>
+      <w:proofErr w:type="spellEnd"/>
+      <w:proofErr w:type="gramEnd"/>
+      <w:r>
+        <w:rPr>
+          <w:highlight w:val="green"/>
+        </w:rPr>
+        <w:t xml:space="preserve"> possible to have moderate E but mild H </w:t>
+      </w:r>
+      <w:proofErr w:type="spellStart"/>
+      <w:r>
+        <w:rPr>
+          <w:highlight w:val="green"/>
+        </w:rPr>
+        <w:t>etc</w:t>
+      </w:r>
+      <w:proofErr w:type="spellEnd"/>
+      <w:r>
+        <w:rPr>
+          <w:highlight w:val="green"/>
+        </w:rPr>
+        <w:t xml:space="preserve"> </w:t>
+      </w:r>
+      <w:r>
+        <w:rPr>
+          <w:highlight w:val="cyan"/>
+        </w:rPr>
+        <w:t>– Done [</w:t>
+      </w:r>
+      <w:r>
+        <w:rPr>
+          <w:highlight w:val="cyan"/>
+        </w:rPr>
+        <w:t>ARIA Event page]</w:t>
       </w:r>
     </w:p>
     <w:p>
@@ -92,11 +152,53 @@
         <w:pStyle w:val="ListParagraph"/>
         <w:numPr>
           <w:ilvl w:val="0"/>
-          <w:numId w:val="2"/>
+          <w:numId w:val="1"/>
         </w:numPr>
-      </w:pPr>
-      <w:r>
+        <w:rPr>
+          <w:highlight w:val="cyan"/>
+        </w:rPr>
+      </w:pPr>
+      <w:r>
+        <w:rPr>
+          <w:highlight w:val="green"/>
+        </w:rPr>
         <w:t xml:space="preserve">Option to check box that says no aria </w:t>
+      </w:r>
+      <w:r>
+        <w:rPr>
+          <w:highlight w:val="cyan"/>
+        </w:rPr>
+        <w:t xml:space="preserve">– </w:t>
+      </w:r>
+      <w:r>
+        <w:rPr>
+          <w:highlight w:val="cyan"/>
+        </w:rPr>
+        <w:t>Done [</w:t>
+      </w:r>
+      <w:r>
+        <w:rPr>
+          <w:highlight w:val="cyan"/>
+        </w:rPr>
+        <w:t xml:space="preserve">MRI </w:t>
+      </w:r>
+      <w:r>
+        <w:rPr>
+          <w:highlight w:val="cyan"/>
+        </w:rPr>
+        <w:t>Update p</w:t>
+      </w:r>
+      <w:r>
+        <w:rPr>
+          <w:highlight w:val="cyan"/>
+        </w:rPr>
+        <w:t>age</w:t>
+      </w:r>
+      <w:r>
+        <w:rPr>
+          <w:highlight w:val="cyan"/>
+        </w:rPr>
+        <w:t>]</w:t>
       </w:r>
     </w:p>
     <w:p>
@@ -104,11 +206,43 @@
         <w:pStyle w:val="ListParagraph"/>
         <w:numPr>
           <w:ilvl w:val="0"/>
-          <w:numId w:val="2"/>
+          <w:numId w:val="1"/>
         </w:numPr>
-      </w:pPr>
-      <w:r>
-        <w:t>Need more options for ARIA status- resolved, improved, worsened.</w:t>
+        <w:rPr>
+          <w:highlight w:val="green"/>
+        </w:rPr>
+      </w:pPr>
+      <w:r>
+        <w:rPr>
+          <w:highlight w:val="green"/>
+        </w:rPr>
+        <w:t>Need more options for ARIA status- resolved, improved</w:t>
+      </w:r>
+      <w:proofErr w:type="gramStart"/>
+      <w:r>
+        <w:rPr>
+          <w:highlight w:val="green"/>
+        </w:rPr>
+        <w:t>, worsened</w:t>
+      </w:r>
+      <w:proofErr w:type="gramEnd"/>
+      <w:r>
+        <w:rPr>
+          <w:highlight w:val="green"/>
+        </w:rPr>
+        <w:t>.</w:t>
+      </w:r>
+      <w:r>
+        <w:rPr>
+          <w:highlight w:val="cyan"/>
+        </w:rPr>
+        <w:t xml:space="preserve"> </w:t>
+      </w:r>
+      <w:r>
+        <w:rPr>
+          <w:highlight w:val="cyan"/>
+        </w:rPr>
+        <w:t>– Done [ARIA Event page]</w:t>
       </w:r>
     </w:p>
     <w:p>
@@ -116,11 +250,54 @@
         <w:pStyle w:val="ListParagraph"/>
         <w:numPr>
           <w:ilvl w:val="0"/>
-          <w:numId w:val="2"/>
+          <w:numId w:val="1"/>
         </w:numPr>
       </w:pPr>
       <w:r>
-        <w:t>Another type of MRI- unscheduled surveillance- for people with sx aria (eg headache).</w:t>
+        <w:rPr>
+          <w:highlight w:val="green"/>
+        </w:rPr>
+        <w:t xml:space="preserve">Another type of MRI- unscheduled surveillance- for people with </w:t>
+      </w:r>
+      <w:proofErr w:type="spellStart"/>
+      <w:r>
+        <w:rPr>
+          <w:highlight w:val="green"/>
+        </w:rPr>
+        <w:t>sx</w:t>
+      </w:r>
+      <w:proofErr w:type="spellEnd"/>
+      <w:r>
+        <w:rPr>
+          <w:highlight w:val="green"/>
+        </w:rPr>
+        <w:t xml:space="preserve"> aria (</w:t>
+      </w:r>
+      <w:proofErr w:type="spellStart"/>
+      <w:r>
+        <w:rPr>
+          <w:highlight w:val="green"/>
+        </w:rPr>
+        <w:t>eg</w:t>
+      </w:r>
+      <w:proofErr w:type="spellEnd"/>
+      <w:r>
+        <w:rPr>
+          <w:highlight w:val="green"/>
+        </w:rPr>
+        <w:t xml:space="preserve"> headache)</w:t>
+      </w:r>
+      <w:r>
+        <w:t>.</w:t>
+      </w:r>
+      <w:r>
+        <w:t>-</w:t>
+      </w:r>
+      <w:r>
+        <w:rPr>
+          <w:highlight w:val="cyan"/>
+        </w:rPr>
+        <w:t>Done [MRI page]</w:t>
       </w:r>
     </w:p>
     <w:p>
@@ -128,11 +305,29 @@
         <w:pStyle w:val="ListParagraph"/>
         <w:numPr>
           <w:ilvl w:val="0"/>
-          <w:numId w:val="2"/>
+          <w:numId w:val="1"/>
         </w:numPr>
       </w:pPr>
       <w:r>
-        <w:t>Add severity rating for infusion reactions: mild, mod, severe, anaphylaxis.</w:t>
+        <w:rPr>
+          <w:highlight w:val="green"/>
+        </w:rPr>
+        <w:t>Add severity rating for infusion reactions: mild, mod, severe, anaphylaxis</w:t>
+      </w:r>
+      <w:r>
+        <w:t>.</w:t>
+      </w:r>
+      <w:r>
+        <w:rPr>
+          <w:highlight w:val="cyan"/>
+        </w:rPr>
+        <w:t xml:space="preserve">- Done </w:t>
+      </w:r>
+      <w:r>
+        <w:rPr>
+          <w:highlight w:val="cyan"/>
+        </w:rPr>
+        <w:t>[Infusion Update page]</w:t>
       </w:r>
     </w:p>
     <w:p>
@@ -168,10 +363,88 @@
     </w:tbl>
     <w:p/>
     <w:p>
+      <w:pPr>
+        <w:pStyle w:val="ListParagraph"/>
+        <w:numPr>
+          <w:ilvl w:val="0"/>
+          <w:numId w:val="2"/>
+        </w:numPr>
+      </w:pPr>
       <w:r>
         <w:t>Baseline MRI hard stop for enrollment- okay.</w:t>
       </w:r>
     </w:p>
+    <w:p>
+      <w:pPr>
+        <w:pStyle w:val="ListParagraph"/>
+        <w:numPr>
+          <w:ilvl w:val="0"/>
+          <w:numId w:val="2"/>
+        </w:numPr>
+      </w:pPr>
+      <w:r>
+        <w:t>Adjust the text field so that all text is displayed</w:t>
+      </w:r>
+    </w:p>
+    <w:p>
+      <w:pPr>
+        <w:pStyle w:val="ListParagraph"/>
+      </w:pPr>
+      <w:r>
+        <w:rPr>
+          <w:noProof/>
+        </w:rPr>
+        <w:lastRenderedPageBreak/>
+        <w:drawing>
+          <wp:inline distT="0" distB="0" distL="0" distR="0" wp14:anchorId="4832286E" wp14:editId="255943DD">
+            <wp:extent cx="5943600" cy="2543175"/>
+            <wp:effectExtent l="0" t="0" r="0" b="0"/>
+            <wp:docPr id="580411744" name="drawing">
+              <a:extLst xmlns:a="http://schemas.openxmlformats.org/drawingml/2006/main">
+                <a:ext uri="{FF2B5EF4-FFF2-40B4-BE49-F238E27FC236}">
+                  <a16:creationId xmlns:a16="http://schemas.microsoft.com/office/drawing/2014/main" id="{14499BC4-BE41-47AA-B09F-77E013F3496E}"/>
+                </a:ext>
+              </a:extLst>
+            </wp:docPr>
+            <wp:cNvGraphicFramePr>
+              <a:graphicFrameLocks xmlns:a="http://schemas.openxmlformats.org/drawingml/2006/main" noChangeAspect="1"/>
+            </wp:cNvGraphicFramePr>
+            <a:graphic xmlns:a="http://schemas.openxmlformats.org/drawingml/2006/main">
+              <a:graphicData uri="http://schemas.openxmlformats.org/drawingml/2006/picture">
+                <pic:pic xmlns:pic="http://schemas.openxmlformats.org/drawingml/2006/picture">
+                  <pic:nvPicPr>
+                    <pic:cNvPr id="580411744" name="Picture 580411744"/>
+                    <pic:cNvPicPr/>
+                  </pic:nvPicPr>
+                  <pic:blipFill>
+                    <a:blip r:embed="rId5">
+                      <a:extLst>
+                        <a:ext uri="{28A0092B-C50C-407E-A947-70E740481C1C}">
+                          <a14:useLocalDpi xmlns:a14="http://schemas.microsoft.com/office/drawing/2010/main"/>
+                        </a:ext>
+                      </a:extLst>
+                    </a:blip>
+                    <a:stretch>
+                      <a:fillRect/>
+                    </a:stretch>
+                  </pic:blipFill>
+                  <pic:spPr>
+                    <a:xfrm>
+                      <a:off x="0" y="0"/>
+                      <a:ext cx="5943600" cy="2543175"/>
+                    </a:xfrm>
+                    <a:prstGeom prst="rect">
+                      <a:avLst/>
+                    </a:prstGeom>
+                  </pic:spPr>
+                </pic:pic>
+              </a:graphicData>
+            </a:graphic>
+          </wp:inline>
+        </w:drawing>
+      </w:r>
+    </w:p>
+    <w:p/>
     <w:p>
       <w:pPr>
         <w:pStyle w:val="Heading1"/>
@@ -199,8 +472,13 @@
             <w:r>
               <w:t xml:space="preserve">Put questions regarding </w:t>
             </w:r>
-            <w:r>
-              <w:t xml:space="preserve">the app use, </w:t>
+            <w:proofErr w:type="gramStart"/>
+            <w:r>
+              <w:t>the app</w:t>
+            </w:r>
+            <w:proofErr w:type="gramEnd"/>
+            <w:r>
+              <w:t xml:space="preserve"> use, </w:t>
             </w:r>
             <w:r>
               <w:t>technical capability, security, etc. here</w:t>
@@ -215,7 +493,7 @@
         <w:pStyle w:val="ListParagraph"/>
         <w:numPr>
           <w:ilvl w:val="0"/>
-          <w:numId w:val="1"/>
+          <w:numId w:val="3"/>
         </w:numPr>
       </w:pPr>
       <w:r>
@@ -227,7 +505,7 @@
         <w:pStyle w:val="ListParagraph"/>
         <w:numPr>
           <w:ilvl w:val="0"/>
-          <w:numId w:val="1"/>
+          <w:numId w:val="3"/>
         </w:numPr>
       </w:pPr>
       <w:r>
@@ -239,7 +517,7 @@
         <w:pStyle w:val="ListParagraph"/>
         <w:numPr>
           <w:ilvl w:val="0"/>
-          <w:numId w:val="1"/>
+          <w:numId w:val="3"/>
         </w:numPr>
       </w:pPr>
       <w:r>
@@ -251,7 +529,7 @@
         <w:pStyle w:val="ListParagraph"/>
         <w:numPr>
           <w:ilvl w:val="0"/>
-          <w:numId w:val="1"/>
+          <w:numId w:val="3"/>
         </w:numPr>
       </w:pPr>
       <w:r>
@@ -263,11 +541,19 @@
         <w:pStyle w:val="ListParagraph"/>
         <w:numPr>
           <w:ilvl w:val="0"/>
-          <w:numId w:val="1"/>
+          <w:numId w:val="3"/>
         </w:numPr>
       </w:pPr>
       <w:r>
-        <w:t>Can we have redundancy within the app. Ability to update infusion or MRI etc after I’ve accessed patient through lookup.</w:t>
+        <w:t xml:space="preserve">Can we have redundancy within the app. Ability to update infusion or MRI </w:t>
+      </w:r>
+      <w:proofErr w:type="spellStart"/>
+      <w:r>
+        <w:t>etc</w:t>
+      </w:r>
+      <w:proofErr w:type="spellEnd"/>
+      <w:r>
+        <w:t xml:space="preserve"> after I’ve accessed patient through lookup.</w:t>
       </w:r>
     </w:p>
     <w:p>
@@ -275,7 +561,7 @@
         <w:pStyle w:val="ListParagraph"/>
         <w:numPr>
           <w:ilvl w:val="0"/>
-          <w:numId w:val="1"/>
+          <w:numId w:val="3"/>
         </w:numPr>
       </w:pPr>
       <w:r>
@@ -390,7 +676,16 @@
           <w:tcPr>
             <w:tcW w:w="3180" w:type="dxa"/>
           </w:tcPr>
-          <w:p/>
+          <w:p>
+            <w:r>
+              <w:t xml:space="preserve">Amyloid related imaging </w:t>
+            </w:r>
+            <w:proofErr w:type="spellStart"/>
+            <w:r>
+              <w:t>abnornalities</w:t>
+            </w:r>
+            <w:proofErr w:type="spellEnd"/>
+          </w:p>
         </w:tc>
         <w:tc>
           <w:tcPr>
@@ -414,7 +709,11 @@
           <w:tcPr>
             <w:tcW w:w="3180" w:type="dxa"/>
           </w:tcPr>
-          <w:p/>
+          <w:p>
+            <w:r>
+              <w:t>Hemorrhage and edema</w:t>
+            </w:r>
+          </w:p>
         </w:tc>
         <w:tc>
           <w:tcPr>
@@ -429,8 +728,13 @@
             <w:tcW w:w="3356" w:type="dxa"/>
           </w:tcPr>
           <w:p>
-            <w:r>
-              <w:t>sx aria</w:t>
+            <w:proofErr w:type="spellStart"/>
+            <w:r>
+              <w:t>sx</w:t>
+            </w:r>
+            <w:proofErr w:type="spellEnd"/>
+            <w:r>
+              <w:t xml:space="preserve"> aria</w:t>
             </w:r>
           </w:p>
         </w:tc>
@@ -447,6 +751,19 @@
           <w:p>
             <w:r>
               <w:t>Headache</w:t>
+            </w:r>
+            <w:r>
+              <w:t xml:space="preserve">, dizziness, gait disturbance, weakness, vision </w:t>
+            </w:r>
+            <w:r>
+              <w:lastRenderedPageBreak/>
+              <w:t>loss/</w:t>
+            </w:r>
+            <w:r>
+              <w:t>change</w:t>
+            </w:r>
+            <w:r>
+              <w:t>s, trouble speaking</w:t>
             </w:r>
           </w:p>
         </w:tc>
@@ -592,6 +909,92 @@
     </w:lvl>
   </w:abstractNum>
   <w:abstractNum w:abstractNumId="1" w15:restartNumberingAfterBreak="0">
+    <w:nsid w:val="5CB1CFD2"/>
+    <w:multiLevelType w:val="hybridMultilevel"/>
+    <w:tmpl w:val="FFFFFFFF"/>
+    <w:lvl w:ilvl="0" w:tplc="B1689758">
+      <w:start w:val="1"/>
+      <w:numFmt w:val="decimal"/>
+      <w:lvlText w:val="%1."/>
+      <w:lvlJc w:val="left"/>
+      <w:pPr>
+        <w:ind w:left="720" w:hanging="360"/>
+      </w:pPr>
+    </w:lvl>
+    <w:lvl w:ilvl="1" w:tplc="776269F4">
+      <w:start w:val="1"/>
+      <w:numFmt w:val="lowerLetter"/>
+      <w:lvlText w:val="%2."/>
+      <w:lvlJc w:val="left"/>
+      <w:pPr>
+        <w:ind w:left="1440" w:hanging="360"/>
+      </w:pPr>
+    </w:lvl>
+    <w:lvl w:ilvl="2" w:tplc="2306F4D0">
+      <w:start w:val="1"/>
+      <w:numFmt w:val="lowerRoman"/>
+      <w:lvlText w:val="%3."/>
+      <w:lvlJc w:val="right"/>
+      <w:pPr>
+        <w:ind w:left="2160" w:hanging="180"/>
+      </w:pPr>
+    </w:lvl>
+    <w:lvl w:ilvl="3" w:tplc="6C823FFA">
+      <w:start w:val="1"/>
+      <w:numFmt w:val="decimal"/>
+      <w:lvlText w:val="%4."/>
+      <w:lvlJc w:val="left"/>
+      <w:pPr>
+        <w:ind w:left="2880" w:hanging="360"/>
+      </w:pPr>
+    </w:lvl>
+    <w:lvl w:ilvl="4" w:tplc="E650503C">
+      <w:start w:val="1"/>
+      <w:numFmt w:val="lowerLetter"/>
+      <w:lvlText w:val="%5."/>
+      <w:lvlJc w:val="left"/>
+      <w:pPr>
+        <w:ind w:left="3600" w:hanging="360"/>
+      </w:pPr>
+    </w:lvl>
+    <w:lvl w:ilvl="5" w:tplc="676E62FE">
+      <w:start w:val="1"/>
+      <w:numFmt w:val="lowerRoman"/>
+      <w:lvlText w:val="%6."/>
+      <w:lvlJc w:val="right"/>
+      <w:pPr>
+        <w:ind w:left="4320" w:hanging="180"/>
+      </w:pPr>
+    </w:lvl>
+    <w:lvl w:ilvl="6" w:tplc="2A40579C">
+      <w:start w:val="1"/>
+      <w:numFmt w:val="decimal"/>
+      <w:lvlText w:val="%7."/>
+      <w:lvlJc w:val="left"/>
+      <w:pPr>
+        <w:ind w:left="5040" w:hanging="360"/>
+      </w:pPr>
+    </w:lvl>
+    <w:lvl w:ilvl="7" w:tplc="5642B316">
+      <w:start w:val="1"/>
+      <w:numFmt w:val="lowerLetter"/>
+      <w:lvlText w:val="%8."/>
+      <w:lvlJc w:val="left"/>
+      <w:pPr>
+        <w:ind w:left="5760" w:hanging="360"/>
+      </w:pPr>
+    </w:lvl>
+    <w:lvl w:ilvl="8" w:tplc="F5D242E0">
+      <w:start w:val="1"/>
+      <w:numFmt w:val="lowerRoman"/>
+      <w:lvlText w:val="%9."/>
+      <w:lvlJc w:val="right"/>
+      <w:pPr>
+        <w:ind w:left="6480" w:hanging="180"/>
+      </w:pPr>
+    </w:lvl>
+  </w:abstractNum>
+  <w:abstractNum w:abstractNumId="2" w15:restartNumberingAfterBreak="0">
     <w:nsid w:val="65565C36"/>
     <w:multiLevelType w:val="hybridMultilevel"/>
     <w:tmpl w:val="95F8EC80"/>
@@ -677,11 +1080,14 @@
       </w:pPr>
     </w:lvl>
   </w:abstractNum>
-  <w:num w:numId="1" w16cid:durableId="262304511">
+  <w:num w:numId="1" w16cid:durableId="1096944055">
+    <w:abstractNumId w:val="0"/>
+  </w:num>
+  <w:num w:numId="2" w16cid:durableId="1870293532">
     <w:abstractNumId w:val="1"/>
   </w:num>
-  <w:num w:numId="2" w16cid:durableId="1096944055">
-    <w:abstractNumId w:val="0"/>
+  <w:num w:numId="3" w16cid:durableId="262304511">
+    <w:abstractNumId w:val="2"/>
   </w:num>
 </w:numbering>
 </file>
@@ -1986,4 +2392,10 @@
     </a:ext>
   </a:extLst>
 </a:theme>
+</file>
+
+<file path=docMetadata/LabelInfo.xml><?xml version="1.0" encoding="utf-8"?>
+<clbl:labelList xmlns:clbl="http://schemas.microsoft.com/office/2020/mipLabelMetadata">
+  <clbl:label id="{5f5c2410-cd60-4dbe-b97e-3c9c38140272}" enabled="0" method="" siteId="{5f5c2410-cd60-4dbe-b97e-3c9c38140272}" removed="1"/>
+</clbl:labelList>
 </file>
</xml_diff>